<commit_message>
Added some link bout figma
</commit_message>
<xml_diff>
--- a/docs/Unibo-MatchSkills.docx
+++ b/docs/Unibo-MatchSkills.docx
@@ -634,7 +634,7 @@
       </w:pPr>
       <w:r>
         <w:pict w14:anchorId="60CB6BB9">
-          <v:rect id="_x0000_i1026" style="width:0;height:1.5pt" o:hralign="center" o:hrstd="t" o:hr="t" fillcolor="#a0a0a0" stroked="f"/>
+          <v:rect id="_x0000_i1027" style="width:0;height:1.5pt" o:hralign="center" o:hrstd="t" o:hr="t" fillcolor="#a0a0a0" stroked="f"/>
         </w:pict>
       </w:r>
     </w:p>
@@ -897,7 +897,7 @@
       </w:pPr>
       <w:r>
         <w:pict w14:anchorId="76F06F7F">
-          <v:rect id="_x0000_i1027" style="width:0;height:1.5pt" o:hralign="center" o:bullet="t" o:hrstd="t" o:hr="t" fillcolor="#a0a0a0" stroked="f"/>
+          <v:rect id="_x0000_i1028" style="width:0;height:1.5pt" o:hralign="center" o:bullet="t" o:hrstd="t" o:hr="t" fillcolor="#a0a0a0" stroked="f"/>
         </w:pict>
       </w:r>
     </w:p>
@@ -1357,7 +1357,7 @@
       </w:pPr>
       <w:r>
         <w:pict w14:anchorId="00F24C6F">
-          <v:rect id="_x0000_i1028" style="width:0;height:1.5pt" o:hralign="center" o:hrstd="t" o:hr="t" fillcolor="#a0a0a0" stroked="f"/>
+          <v:rect id="_x0000_i1029" style="width:0;height:1.5pt" o:hralign="center" o:hrstd="t" o:hr="t" fillcolor="#a0a0a0" stroked="f"/>
         </w:pict>
       </w:r>
     </w:p>
@@ -1495,7 +1495,7 @@
       </w:pPr>
       <w:r>
         <w:pict w14:anchorId="21BA2EF2">
-          <v:rect id="_x0000_i1029" style="width:0;height:1.5pt" o:hralign="center" o:hrstd="t" o:hr="t" fillcolor="#a0a0a0" stroked="f"/>
+          <v:rect id="_x0000_i1030" style="width:0;height:1.5pt" o:hralign="center" o:hrstd="t" o:hr="t" fillcolor="#a0a0a0" stroked="f"/>
         </w:pict>
       </w:r>
     </w:p>
@@ -1604,6 +1604,183 @@
       <w:r>
         <w:lastRenderedPageBreak/>
         <w:t>FIGMA</w:t>
+      </w:r>
+    </w:p>
+    <w:p>
+      <w:pPr>
+        <w:spacing w:after="0"/>
+        <w:rPr>
+          <w:lang w:val="en-GB"/>
+        </w:rPr>
+      </w:pPr>
+      <w:r>
+        <w:rPr>
+          <w:b/>
+          <w:bCs/>
+          <w:lang w:val="en-GB"/>
+        </w:rPr>
+        <w:t>Palette</w:t>
+      </w:r>
+      <w:r>
+        <w:rPr>
+          <w:lang w:val="en-GB"/>
+        </w:rPr>
+        <w:t>:</w:t>
+      </w:r>
+    </w:p>
+    <w:p>
+      <w:pPr>
+        <w:spacing w:after="0"/>
+        <w:rPr>
+          <w:lang w:val="en-GB"/>
+        </w:rPr>
+      </w:pPr>
+      <w:r>
+        <w:rPr>
+          <w:lang w:val="en-GB"/>
+        </w:rPr>
+        <w:t xml:space="preserve">BLU -&gt; </w:t>
+      </w:r>
+      <w:r>
+        <w:rPr>
+          <w:lang w:val="en-GB"/>
+        </w:rPr>
+        <w:tab/>
+        <w:t xml:space="preserve"> #0757A9</w:t>
+      </w:r>
+    </w:p>
+    <w:p>
+      <w:pPr>
+        <w:spacing w:after="0"/>
+        <w:rPr>
+          <w:lang w:val="en-GB"/>
+        </w:rPr>
+      </w:pPr>
+      <w:r>
+        <w:rPr>
+          <w:lang w:val="en-GB"/>
+        </w:rPr>
+        <w:t>ROSSO -&gt; #BE2E16</w:t>
+      </w:r>
+    </w:p>
+    <w:p>
+      <w:pPr>
+        <w:spacing w:after="0"/>
+        <w:rPr>
+          <w:lang w:val="en-GB"/>
+        </w:rPr>
+      </w:pPr>
+    </w:p>
+    <w:p>
+      <w:pPr>
+        <w:spacing w:after="0"/>
+        <w:rPr>
+          <w:lang w:val="en-GB"/>
+        </w:rPr>
+      </w:pPr>
+      <w:r>
+        <w:rPr>
+          <w:b/>
+          <w:bCs/>
+          <w:lang w:val="en-GB"/>
+        </w:rPr>
+        <w:t>Font</w:t>
+      </w:r>
+      <w:r>
+        <w:rPr>
+          <w:lang w:val="en-GB"/>
+        </w:rPr>
+        <w:t>:</w:t>
+      </w:r>
+    </w:p>
+    <w:p>
+      <w:pPr>
+        <w:spacing w:after="0"/>
+        <w:rPr>
+          <w:lang w:val="en-GB"/>
+        </w:rPr>
+      </w:pPr>
+      <w:r>
+        <w:rPr>
+          <w:lang w:val="en-GB"/>
+        </w:rPr>
+        <w:t>Monserrat</w:t>
+      </w:r>
+    </w:p>
+    <w:p>
+      <w:pPr>
+        <w:spacing w:after="0"/>
+        <w:rPr>
+          <w:lang w:val="en-GB"/>
+        </w:rPr>
+      </w:pPr>
+    </w:p>
+    <w:p>
+      <w:pPr>
+        <w:spacing w:after="0"/>
+        <w:rPr>
+          <w:lang w:val="en-GB"/>
+        </w:rPr>
+      </w:pPr>
+      <w:r>
+        <w:rPr>
+          <w:b/>
+          <w:bCs/>
+          <w:lang w:val="en-GB"/>
+        </w:rPr>
+        <w:t>Icons</w:t>
+      </w:r>
+      <w:r>
+        <w:rPr>
+          <w:lang w:val="en-GB"/>
+        </w:rPr>
+        <w:t xml:space="preserve">: </w:t>
+      </w:r>
+    </w:p>
+    <w:p>
+      <w:pPr>
+        <w:spacing w:after="0"/>
+        <w:rPr>
+          <w:lang w:val="en-GB"/>
+        </w:rPr>
+      </w:pPr>
+      <w:hyperlink r:id="rId9" w:history="1">
+        <w:r>
+          <w:rPr>
+            <w:rStyle w:val="Collegamentoipertestuale"/>
+            <w:lang w:val="en-GB"/>
+          </w:rPr>
+          <w:t>https://www.figma.com/design/Tp6rUcouQbl31zSoBEFG2P/Figma-Material-Design-System-v3_1-preview?node-id=0-9198&amp;p=f&amp;t=KJjMX4YU6gygr4s1-0</w:t>
+        </w:r>
+      </w:hyperlink>
+    </w:p>
+    <w:p>
+      <w:pPr>
+        <w:spacing w:after="0"/>
+        <w:rPr>
+          <w:lang w:val="en-GB"/>
+        </w:rPr>
+      </w:pPr>
+    </w:p>
+    <w:p>
+      <w:pPr>
+        <w:rPr>
+          <w:lang w:val="en-GB"/>
+        </w:rPr>
+      </w:pPr>
+    </w:p>
+    <w:p>
+      <w:pPr>
+        <w:pStyle w:val="Titolo2"/>
+        <w:rPr>
+          <w:lang w:val="en-GB"/>
+        </w:rPr>
+      </w:pPr>
+      <w:r>
+        <w:rPr>
+          <w:lang w:val="en-GB"/>
+        </w:rPr>
+        <w:t>USE CASES</w:t>
       </w:r>
     </w:p>
     <w:p>
@@ -1621,7 +1798,106 @@
         <w:rPr>
           <w:lang w:val="en-GB"/>
         </w:rPr>
-        <w:t>Palette Chrome Extensions Saved for Palette</w:t>
+        <w:t>Con Figma o Canva</w:t>
+      </w:r>
+    </w:p>
+    <w:p>
+      <w:pPr>
+        <w:pStyle w:val="Titolo2"/>
+      </w:pPr>
+    </w:p>
+    <w:p>
+      <w:pPr>
+        <w:pStyle w:val="Titolo2"/>
+      </w:pPr>
+      <w:r>
+        <w:t>REPOSITORY</w:t>
+      </w:r>
+    </w:p>
+    <w:p>
+      <w:pPr>
+        <w:pStyle w:val="Paragrafoelenco"/>
+        <w:numPr>
+          <w:ilvl w:val="0"/>
+          <w:numId w:val="37"/>
+        </w:numPr>
+        <w:rPr>
+          <w:b/>
+          <w:bCs/>
+        </w:rPr>
+      </w:pPr>
+      <w:r>
+        <w:rPr>
+          <w:b/>
+          <w:bCs/>
+        </w:rPr>
+        <w:t>Integrare Composer</w:t>
+      </w:r>
+    </w:p>
+    <w:p>
+      <w:pPr>
+        <w:pStyle w:val="Paragrafoelenco"/>
+        <w:numPr>
+          <w:ilvl w:val="0"/>
+          <w:numId w:val="37"/>
+        </w:numPr>
+        <w:rPr>
+          <w:b/>
+          <w:bCs/>
+        </w:rPr>
+      </w:pPr>
+      <w:r>
+        <w:rPr>
+          <w:b/>
+          <w:bCs/>
+        </w:rPr>
+        <w:t>[</w:t>
+      </w:r>
+      <w:r>
+        <w:rPr>
+          <w:b/>
+          <w:bCs/>
+          <w:color w:val="EE0000"/>
+        </w:rPr>
+        <w:t>NOT NOW</w:t>
+      </w:r>
+      <w:r>
+        <w:rPr>
+          <w:b/>
+          <w:bCs/>
+        </w:rPr>
+        <w:t xml:space="preserve">] </w:t>
+      </w:r>
+      <w:r>
+        <w:rPr>
+          <w:b/>
+          <w:bCs/>
+        </w:rPr>
+        <w:t>Integrare Validatore automatico W3C</w:t>
+      </w:r>
+      <w:r>
+        <w:rPr>
+          <w:b/>
+          <w:bCs/>
+        </w:rPr>
+        <w:t xml:space="preserve"> </w:t>
+      </w:r>
+    </w:p>
+    <w:p>
+      <w:pPr>
+        <w:pStyle w:val="Paragrafoelenco"/>
+        <w:rPr>
+          <w:b/>
+          <w:bCs/>
+        </w:rPr>
+      </w:pPr>
+    </w:p>
+    <w:p>
+      <w:pPr>
+        <w:pStyle w:val="Titolo2"/>
+      </w:pPr>
+      <w:r>
+        <w:t>DATABASE</w:t>
       </w:r>
     </w:p>
     <w:p>
@@ -1631,230 +1907,35 @@
           <w:ilvl w:val="0"/>
           <w:numId w:val="36"/>
         </w:numPr>
-        <w:rPr>
-          <w:lang w:val="en-GB"/>
-        </w:rPr>
-      </w:pPr>
-      <w:r>
-        <w:rPr>
-          <w:lang w:val="en-GB"/>
-        </w:rPr>
-        <w:t>Font Checker Chrome Extensions</w:t>
-      </w:r>
-    </w:p>
-    <w:p>
-      <w:pPr>
-        <w:pStyle w:val="Paragrafoelenco"/>
-        <w:numPr>
-          <w:ilvl w:val="0"/>
-          <w:numId w:val="36"/>
-        </w:numPr>
-      </w:pPr>
-      <w:r>
-        <w:t xml:space="preserve">Palette sito web “Virtuale </w:t>
-      </w:r>
-      <w:proofErr w:type="spellStart"/>
-      <w:r>
-        <w:t>Unibo</w:t>
-      </w:r>
-      <w:proofErr w:type="spellEnd"/>
-      <w:r>
-        <w:t>”</w:t>
-      </w:r>
-    </w:p>
-    <w:p>
-      <w:pPr>
-        <w:pStyle w:val="Paragrafoelenco"/>
-        <w:numPr>
-          <w:ilvl w:val="0"/>
-          <w:numId w:val="36"/>
-        </w:numPr>
-        <w:rPr>
-          <w:lang w:val="en-GB"/>
-        </w:rPr>
-      </w:pPr>
-      <w:r>
-        <w:rPr>
-          <w:lang w:val="en-GB"/>
-        </w:rPr>
-        <w:t>Font: SEGOE UI</w:t>
-      </w:r>
-    </w:p>
-    <w:p>
-      <w:pPr>
-        <w:pStyle w:val="Paragrafoelenco"/>
-        <w:rPr>
-          <w:lang w:val="en-GB"/>
-        </w:rPr>
-      </w:pPr>
-    </w:p>
-    <w:p>
-      <w:pPr>
-        <w:pStyle w:val="Titolo2"/>
-        <w:rPr>
-          <w:lang w:val="en-GB"/>
-        </w:rPr>
-      </w:pPr>
-      <w:r>
-        <w:rPr>
-          <w:lang w:val="en-GB"/>
-        </w:rPr>
-        <w:t>USE CASES</w:t>
-      </w:r>
-    </w:p>
-    <w:p>
-      <w:pPr>
-        <w:pStyle w:val="Paragrafoelenco"/>
-        <w:numPr>
-          <w:ilvl w:val="0"/>
-          <w:numId w:val="36"/>
-        </w:numPr>
-        <w:rPr>
-          <w:lang w:val="en-GB"/>
-        </w:rPr>
-      </w:pPr>
-      <w:r>
-        <w:rPr>
-          <w:lang w:val="en-GB"/>
-        </w:rPr>
-        <w:t>Con Figma o Canva</w:t>
-      </w:r>
-    </w:p>
-    <w:p>
-      <w:pPr>
-        <w:pStyle w:val="Titolo2"/>
-      </w:pPr>
-    </w:p>
-    <w:p>
-      <w:pPr>
-        <w:pStyle w:val="Titolo2"/>
-      </w:pPr>
-      <w:r>
-        <w:t>REPOSITORY</w:t>
-      </w:r>
-    </w:p>
-    <w:p>
-      <w:pPr>
-        <w:pStyle w:val="Paragrafoelenco"/>
-        <w:numPr>
-          <w:ilvl w:val="0"/>
-          <w:numId w:val="37"/>
-        </w:numPr>
+      </w:pPr>
+      <w:r>
         <w:rPr>
           <w:b/>
           <w:bCs/>
         </w:rPr>
-      </w:pPr>
+        <w:t>Integrare</w:t>
+      </w:r>
+      <w:r>
+        <w:t xml:space="preserve"> </w:t>
+      </w:r>
       <w:r>
         <w:rPr>
           <w:b/>
           <w:bCs/>
         </w:rPr>
-        <w:t>Integrare Composer</w:t>
-      </w:r>
-    </w:p>
-    <w:p>
-      <w:pPr>
-        <w:pStyle w:val="Paragrafoelenco"/>
-        <w:numPr>
-          <w:ilvl w:val="0"/>
-          <w:numId w:val="37"/>
-        </w:numPr>
+        <w:t xml:space="preserve">nella </w:t>
+      </w:r>
+      <w:r>
         <w:rPr>
           <w:b/>
           <w:bCs/>
         </w:rPr>
-      </w:pPr>
-      <w:r>
-        <w:rPr>
-          <w:b/>
-          <w:bCs/>
-        </w:rPr>
-        <w:t>[</w:t>
-      </w:r>
-      <w:r>
-        <w:rPr>
-          <w:b/>
-          <w:bCs/>
-          <w:color w:val="EE0000"/>
-        </w:rPr>
-        <w:t>NOT NOW</w:t>
-      </w:r>
-      <w:r>
-        <w:rPr>
-          <w:b/>
-          <w:bCs/>
-        </w:rPr>
-        <w:t xml:space="preserve">] </w:t>
-      </w:r>
-      <w:r>
-        <w:rPr>
-          <w:b/>
-          <w:bCs/>
-        </w:rPr>
-        <w:t>Integrare Validatore automatico W3C</w:t>
-      </w:r>
-      <w:r>
-        <w:rPr>
-          <w:b/>
-          <w:bCs/>
-        </w:rPr>
-        <w:t xml:space="preserve"> </w:t>
-      </w:r>
-    </w:p>
-    <w:p>
-      <w:pPr>
-        <w:pStyle w:val="Paragrafoelenco"/>
-        <w:rPr>
-          <w:b/>
-          <w:bCs/>
-        </w:rPr>
-      </w:pPr>
-    </w:p>
-    <w:p>
-      <w:pPr>
-        <w:pStyle w:val="Titolo2"/>
-      </w:pPr>
-      <w:r>
-        <w:t>DATABASE</w:t>
-      </w:r>
-    </w:p>
-    <w:p>
-      <w:pPr>
-        <w:pStyle w:val="Paragrafoelenco"/>
-        <w:numPr>
-          <w:ilvl w:val="0"/>
-          <w:numId w:val="36"/>
-        </w:numPr>
-      </w:pPr>
-      <w:r>
-        <w:rPr>
-          <w:b/>
-          <w:bCs/>
-        </w:rPr>
-        <w:t>Integrare</w:t>
-      </w:r>
-      <w:r>
-        <w:t xml:space="preserve"> </w:t>
-      </w:r>
-      <w:r>
-        <w:rPr>
-          <w:b/>
-          <w:bCs/>
-        </w:rPr>
-        <w:t xml:space="preserve">nella </w:t>
-      </w:r>
-      <w:r>
-        <w:rPr>
-          <w:b/>
-          <w:bCs/>
-        </w:rPr>
         <w:t>repo</w:t>
       </w:r>
       <w:r>
         <w:t xml:space="preserve">: </w:t>
       </w:r>
-      <w:hyperlink r:id="rId9" w:history="1">
+      <w:hyperlink r:id="rId10" w:history="1">
         <w:r>
           <w:rPr>
             <w:rStyle w:val="Collegamentoipertestuale"/>
@@ -1863,13 +1944,7 @@
         </w:r>
       </w:hyperlink>
     </w:p>
-    <w:p>
-      <w:pPr>
-        <w:rPr>
-          <w:lang w:val="en-GB"/>
-        </w:rPr>
-      </w:pPr>
-    </w:p>
+    <w:p/>
     <w:p>
       <w:pPr>
         <w:pStyle w:val="Titolo2"/>
@@ -1934,27 +2009,13 @@
           <w:lang w:val="en-GB"/>
         </w:rPr>
       </w:pPr>
-      <w:hyperlink r:id="rId10" w:history="1">
+      <w:hyperlink r:id="rId11" w:history="1">
         <w:r>
           <w:rPr>
             <w:rStyle w:val="Collegamentoipertestuale"/>
             <w:lang w:val="en-GB"/>
           </w:rPr>
-          <w:t>https://www.openhackathons.</w:t>
-        </w:r>
-        <w:r>
-          <w:rPr>
-            <w:rStyle w:val="Collegamentoipertestuale"/>
-            <w:lang w:val="en-GB"/>
-          </w:rPr>
-          <w:t>o</w:t>
-        </w:r>
-        <w:r>
-          <w:rPr>
-            <w:rStyle w:val="Collegamentoipertestuale"/>
-            <w:lang w:val="en-GB"/>
-          </w:rPr>
-          <w:t>rg/s/blog</w:t>
+          <w:t>https://www.openhackathons.org/s/blog</w:t>
         </w:r>
       </w:hyperlink>
     </w:p>
@@ -1969,24 +2030,12 @@
           <w:lang w:val="en-GB"/>
         </w:rPr>
       </w:pPr>
-      <w:hyperlink r:id="rId11" w:history="1">
+      <w:hyperlink r:id="rId12" w:history="1">
         <w:r>
           <w:rPr>
             <w:rStyle w:val="Collegamentoipertestuale"/>
           </w:rPr>
-          <w:t>https://devpost.</w:t>
-        </w:r>
-        <w:r>
-          <w:rPr>
-            <w:rStyle w:val="Collegamentoipertestuale"/>
-          </w:rPr>
-          <w:t>c</w:t>
-        </w:r>
-        <w:r>
-          <w:rPr>
-            <w:rStyle w:val="Collegamentoipertestuale"/>
-          </w:rPr>
-          <w:t>om/</w:t>
+          <w:t>https://devpost.com/</w:t>
         </w:r>
       </w:hyperlink>
     </w:p>
@@ -2013,6 +2062,9 @@
     <w:p>
       <w:pPr>
         <w:pStyle w:val="Testocommento"/>
+        <w:rPr>
+          <w:lang w:val="en-GB"/>
+        </w:rPr>
       </w:pPr>
       <w:r>
         <w:rPr>
@@ -2021,19 +2073,20 @@
         <w:annotationRef/>
       </w:r>
       <w:r>
-        <w:t xml:space="preserve">TODO Casali: Authentication, </w:t>
-      </w:r>
-      <w:proofErr w:type="spellStart"/>
-      <w:r>
-        <w:t>Authorization</w:t>
-      </w:r>
-      <w:proofErr w:type="spellEnd"/>
+        <w:rPr>
+          <w:lang w:val="en-GB"/>
+        </w:rPr>
+        <w:t>TODO Casali: Authentication, Authorization</w:t>
+      </w:r>
     </w:p>
   </w:comment>
   <w:comment w:id="1" w:author="luca pulga" w:date="2025-11-20T17:48:00Z" w:initials="lp">
     <w:p>
       <w:pPr>
         <w:pStyle w:val="Testocommento"/>
+        <w:rPr>
+          <w:lang w:val="en-GB"/>
+        </w:rPr>
       </w:pPr>
       <w:r>
         <w:rPr>
@@ -2041,20 +2094,22 @@
         </w:rPr>
         <w:annotationRef/>
       </w:r>
-      <w:proofErr w:type="spellStart"/>
       <w:r>
         <w:rPr>
           <w:rStyle w:val="Rimandocommento"/>
+          <w:lang w:val="en-GB"/>
         </w:rPr>
         <w:t>Suspended</w:t>
       </w:r>
-      <w:proofErr w:type="spellEnd"/>
     </w:p>
   </w:comment>
   <w:comment w:id="3" w:author="luca pulga" w:date="2025-12-17T18:47:00Z" w:initials="lp">
     <w:p>
       <w:pPr>
         <w:pStyle w:val="Testocommento"/>
+        <w:rPr>
+          <w:lang w:val="en-GB"/>
+        </w:rPr>
       </w:pPr>
       <w:r>
         <w:rPr>
@@ -2069,17 +2124,18 @@
         <w:annotationRef/>
       </w:r>
       <w:r>
-        <w:t xml:space="preserve">TODO Casali: Authentication, </w:t>
-      </w:r>
-      <w:proofErr w:type="spellStart"/>
-      <w:r>
-        <w:t>Authorization</w:t>
-      </w:r>
-      <w:proofErr w:type="spellEnd"/>
+        <w:rPr>
+          <w:lang w:val="en-GB"/>
+        </w:rPr>
+        <w:t>TODO Casali: Authentication, Authorization</w:t>
+      </w:r>
     </w:p>
     <w:p>
       <w:pPr>
         <w:pStyle w:val="Testocommento"/>
+        <w:rPr>
+          <w:lang w:val="en-GB"/>
+        </w:rPr>
       </w:pPr>
       <w:r>
         <w:rPr>
@@ -2087,163 +2143,138 @@
         </w:rPr>
         <w:annotationRef/>
       </w:r>
-      <w:proofErr w:type="spellStart"/>
-      <w:r>
-        <w:rPr>
-          <w:rStyle w:val="Rimandocommento"/>
-        </w:rPr>
-        <w:t>Suspended</w:t>
-      </w:r>
-      <w:proofErr w:type="spellEnd"/>
-    </w:p>
-    <w:p>
-      <w:pPr>
-        <w:pStyle w:val="Testocommento"/>
-      </w:pPr>
-      <w:r>
-        <w:rPr>
-          <w:rStyle w:val="Rimandocommento"/>
-        </w:rPr>
-        <w:annotationRef/>
-      </w:r>
-      <w:r>
-        <w:t xml:space="preserve">TODO Mancio: </w:t>
-      </w:r>
-      <w:proofErr w:type="spellStart"/>
-      <w:r>
-        <w:t>Requests</w:t>
-      </w:r>
-      <w:proofErr w:type="spellEnd"/>
-      <w:r>
-        <w:t xml:space="preserve"> su DB (con </w:t>
-      </w:r>
-      <w:proofErr w:type="spellStart"/>
-      <w:r>
-        <w:t>inbox</w:t>
-      </w:r>
-      <w:proofErr w:type="spellEnd"/>
-      <w:r>
-        <w:t>)</w:t>
-      </w:r>
-    </w:p>
-    <w:p>
-      <w:pPr>
-        <w:pStyle w:val="Testocommento"/>
-      </w:pPr>
-      <w:r>
-        <w:rPr>
-          <w:rStyle w:val="Rimandocommento"/>
-        </w:rPr>
-        <w:annotationRef/>
-      </w:r>
-      <w:hyperlink r:id="rId1" w:history="1">
-        <w:r>
-          <w:rPr>
-            <w:rStyle w:val="Collegamentoipertestuale"/>
-          </w:rPr>
-          <w:t>https://www.php.net/manual/en/function.mail.php</w:t>
-        </w:r>
-      </w:hyperlink>
-    </w:p>
-    <w:p>
-      <w:pPr>
-        <w:pStyle w:val="Testocommento"/>
-        <w:rPr>
-          <w:lang w:val="en-GB"/>
-        </w:rPr>
-      </w:pPr>
-      <w:r>
-        <w:rPr>
-          <w:lang w:val="en-GB"/>
-        </w:rPr>
-        <w:t xml:space="preserve">Send email of </w:t>
-      </w:r>
-      <w:proofErr w:type="spellStart"/>
-      <w:proofErr w:type="gramStart"/>
-      <w:r>
-        <w:rPr>
-          <w:lang w:val="en-GB"/>
-        </w:rPr>
-        <w:t>p</w:t>
-      </w:r>
-      <w:r>
-        <w:rPr>
-          <w:lang w:val="en-GB"/>
-        </w:rPr>
-        <w:t>ariticpation</w:t>
-      </w:r>
-      <w:proofErr w:type="spellEnd"/>
-      <w:r>
-        <w:rPr>
-          <w:lang w:val="en-GB"/>
-        </w:rPr>
-        <w:t xml:space="preserve"> </w:t>
-      </w:r>
-      <w:r>
-        <w:rPr>
-          <w:lang w:val="en-GB"/>
-        </w:rPr>
-        <w:t xml:space="preserve"> (</w:t>
-      </w:r>
-      <w:proofErr w:type="spellStart"/>
-      <w:proofErr w:type="gramEnd"/>
-      <w:r>
-        <w:rPr>
-          <w:lang w:val="en-GB"/>
-        </w:rPr>
-        <w:t>effetto</w:t>
-      </w:r>
-      <w:proofErr w:type="spellEnd"/>
-      <w:r>
-        <w:rPr>
-          <w:lang w:val="en-GB"/>
-        </w:rPr>
-        <w:t xml:space="preserve"> WOW 4 pt)</w:t>
-      </w:r>
-    </w:p>
-    <w:p>
-      <w:pPr>
-        <w:pStyle w:val="Testocommento"/>
-        <w:rPr>
-          <w:lang w:val="en-GB"/>
-        </w:rPr>
-      </w:pPr>
-      <w:r>
-        <w:rPr>
-          <w:rStyle w:val="Rimandocommento"/>
-        </w:rPr>
-        <w:annotationRef/>
-      </w:r>
-      <w:proofErr w:type="spellStart"/>
       <w:r>
         <w:rPr>
           <w:rStyle w:val="Rimandocommento"/>
           <w:lang w:val="en-GB"/>
         </w:rPr>
-        <w:t>Pannello</w:t>
+        <w:t>Suspended</w:t>
+      </w:r>
+    </w:p>
+    <w:p>
+      <w:pPr>
+        <w:pStyle w:val="Testocommento"/>
+        <w:rPr>
+          <w:lang w:val="en-GB"/>
+        </w:rPr>
+      </w:pPr>
+      <w:r>
+        <w:rPr>
+          <w:rStyle w:val="Rimandocommento"/>
+        </w:rPr>
+        <w:annotationRef/>
+      </w:r>
+      <w:r>
+        <w:rPr>
+          <w:lang w:val="en-GB"/>
+        </w:rPr>
+        <w:t>TODO Mancio: Requests su DB (con inbox)</w:t>
+      </w:r>
+    </w:p>
+    <w:p>
+      <w:pPr>
+        <w:pStyle w:val="Testocommento"/>
+        <w:rPr>
+          <w:lang w:val="en-GB"/>
+        </w:rPr>
+      </w:pPr>
+      <w:r>
+        <w:rPr>
+          <w:rStyle w:val="Rimandocommento"/>
+        </w:rPr>
+        <w:annotationRef/>
+      </w:r>
+      <w:r>
+        <w:fldChar w:fldCharType="begin"/>
+      </w:r>
+      <w:r>
+        <w:rPr>
+          <w:lang w:val="en-GB"/>
+        </w:rPr>
+        <w:instrText>HYPERLINK "https://www.php.net/manual/en/function.mail.php"</w:instrText>
+      </w:r>
+      <w:r>
+        <w:fldChar w:fldCharType="separate"/>
+      </w:r>
+      <w:r>
+        <w:rPr>
+          <w:rStyle w:val="Collegamentoipertestuale"/>
+          <w:lang w:val="en-GB"/>
+        </w:rPr>
+        <w:t>https://www.php.net/manual/en/function.mail.php</w:t>
+      </w:r>
+      <w:r>
+        <w:fldChar w:fldCharType="end"/>
+      </w:r>
+    </w:p>
+    <w:p>
+      <w:pPr>
+        <w:pStyle w:val="Testocommento"/>
+        <w:rPr>
+          <w:lang w:val="en-GB"/>
+        </w:rPr>
+      </w:pPr>
+      <w:r>
+        <w:rPr>
+          <w:lang w:val="en-GB"/>
+        </w:rPr>
+        <w:t xml:space="preserve">Send email of </w:t>
+      </w:r>
+      <w:proofErr w:type="spellStart"/>
+      <w:r>
+        <w:rPr>
+          <w:lang w:val="en-GB"/>
+        </w:rPr>
+        <w:t>p</w:t>
+      </w:r>
+      <w:r>
+        <w:rPr>
+          <w:lang w:val="en-GB"/>
+        </w:rPr>
+        <w:t>ariticpation</w:t>
       </w:r>
       <w:proofErr w:type="spellEnd"/>
       <w:r>
         <w:rPr>
+          <w:lang w:val="en-GB"/>
+        </w:rPr>
+        <w:t xml:space="preserve">  (</w:t>
+      </w:r>
+      <w:proofErr w:type="spellStart"/>
+      <w:r>
+        <w:rPr>
+          <w:lang w:val="en-GB"/>
+        </w:rPr>
+        <w:t>effetto</w:t>
+      </w:r>
+      <w:proofErr w:type="spellEnd"/>
+      <w:r>
+        <w:rPr>
+          <w:lang w:val="en-GB"/>
+        </w:rPr>
+        <w:t xml:space="preserve"> WOW 4 pt)</w:t>
+      </w:r>
+    </w:p>
+    <w:p>
+      <w:pPr>
+        <w:pStyle w:val="Testocommento"/>
+      </w:pPr>
+      <w:r>
+        <w:rPr>
           <w:rStyle w:val="Rimandocommento"/>
-          <w:lang w:val="en-GB"/>
-        </w:rPr>
-        <w:t xml:space="preserve"> extra</w:t>
+        </w:rPr>
+        <w:annotationRef/>
       </w:r>
       <w:r>
         <w:rPr>
           <w:rStyle w:val="Rimandocommento"/>
-          <w:lang w:val="en-GB"/>
-        </w:rPr>
-        <w:t xml:space="preserve"> </w:t>
+        </w:rPr>
+        <w:t xml:space="preserve">Pannello extra </w:t>
       </w:r>
     </w:p>
     <w:p>
       <w:pPr>
         <w:pStyle w:val="Testocommento"/>
-        <w:rPr>
-          <w:lang w:val="en-GB"/>
-        </w:rPr>
       </w:pPr>
     </w:p>
   </w:comment>
@@ -2290,7 +2321,7 @@
         </w:rPr>
         <w:annotationRef/>
       </w:r>
-      <w:hyperlink r:id="rId2" w:history="1">
+      <w:hyperlink r:id="rId1" w:history="1">
         <w:r>
           <w:rPr>
             <w:rStyle w:val="Collegamentoipertestuale"/>
@@ -2420,12 +2451,12 @@
 <w:numbering xmlns:wpc="http://schemas.microsoft.com/office/word/2010/wordprocessingCanvas" xmlns:cx="http://schemas.microsoft.com/office/drawing/2014/chartex" xmlns:cx1="http://schemas.microsoft.com/office/drawing/2015/9/8/chartex" xmlns:cx2="http://schemas.microsoft.com/office/drawing/2015/10/21/chartex" xmlns:cx3="http://schemas.microsoft.com/office/drawing/2016/5/9/chartex" xmlns:cx4="http://schemas.microsoft.com/office/drawing/2016/5/10/chartex" xmlns:cx5="http://schemas.microsoft.com/office/drawing/2016/5/11/chartex" xmlns:cx6="http://schemas.microsoft.com/office/drawing/2016/5/12/chartex" xmlns:cx7="http://schemas.microsoft.com/office/drawing/2016/5/13/chartex" xmlns:cx8="http://schemas.microsoft.com/office/drawing/2016/5/14/chartex" xmlns:mc="http://schemas.openxmlformats.org/markup-compatibility/2006" xmlns:aink="http://schemas.microsoft.com/office/drawing/2016/ink" xmlns:am3d="http://schemas.microsoft.com/office/drawing/2017/model3d" xmlns:o="urn:schemas-microsoft-com:office:office" xmlns:oel="http://schemas.microsoft.com/office/2019/extlst" xmlns:r="http://schemas.openxmlformats.org/officeDocument/2006/relationships" xmlns:m="http://schemas.openxmlformats.org/officeDocument/2006/math" xmlns:v="urn:schemas-microsoft-com:vml" xmlns:wp14="http://schemas.microsoft.com/office/word/2010/wordprocessingDrawing" xmlns:wp="http://schemas.openxmlformats.org/drawingml/2006/wordprocessingDrawing" xmlns:w10="urn:schemas-microsoft-com:office:word" xmlns:w="http://schemas.openxmlformats.org/wordprocessingml/2006/main" xmlns:w14="http://schemas.microsoft.com/office/word/2010/wordml" xmlns:w15="http://schemas.microsoft.com/office/word/2012/wordml" xmlns:w16cex="http://schemas.microsoft.com/office/word/2018/wordml/cex" xmlns:w16cid="http://schemas.microsoft.com/office/word/2016/wordml/cid" xmlns:w16="http://schemas.microsoft.com/office/word/2018/wordml" xmlns:w16du="http://schemas.microsoft.com/office/word/2023/wordml/word16du" xmlns:w16sdtdh="http://schemas.microsoft.com/office/word/2020/wordml/sdtdatahash" xmlns:w16sdtfl="http://schemas.microsoft.com/office/word/2024/wordml/sdtformatlock" xmlns:w16se="http://schemas.microsoft.com/office/word/2015/wordml/symex" xmlns:wpg="http://schemas.microsoft.com/office/word/2010/wordprocessingGroup" xmlns:wpi="http://schemas.microsoft.com/office/word/2010/wordprocessingInk" xmlns:wne="http://schemas.microsoft.com/office/word/2006/wordml" xmlns:wps="http://schemas.microsoft.com/office/word/2010/wordprocessingShape" mc:Ignorable="w14 w15 w16se w16cid w16 w16cex w16sdtdh w16sdtfl w16du wp14">
   <w:numPicBullet w:numPicBulletId="0">
     <w:pict>
-      <v:rect id="_x0000_i1085" style="width:0;height:1.5pt" o:hralign="center" o:bullet="t" o:hrstd="t" o:hr="t" fillcolor="#a0a0a0" stroked="f"/>
+      <v:rect id="_x0000_i1038" style="width:0;height:1.5pt" o:hralign="center" o:bullet="t" o:hrstd="t" o:hr="t" fillcolor="#a0a0a0" stroked="f"/>
     </w:pict>
   </w:numPicBullet>
   <w:numPicBullet w:numPicBulletId="1">
     <w:pict>
-      <v:rect id="_x0000_i1086" style="width:0;height:1.5pt" o:hralign="center" o:bullet="t" o:hrstd="t" o:hr="t" fillcolor="#a0a0a0" stroked="f"/>
+      <v:rect id="_x0000_i1039" style="width:0;height:1.5pt" o:hralign="center" o:bullet="t" o:hrstd="t" o:hr="t" fillcolor="#a0a0a0" stroked="f"/>
     </w:pict>
   </w:numPicBullet>
   <w:abstractNum w:abstractNumId="0" w15:restartNumberingAfterBreak="0">

</xml_diff>

<commit_message>
Added logo and landing page pics. User personas and Scenarios. Created figma Events mockup (palette, fonts, CTA, text)
</commit_message>
<xml_diff>
--- a/docs/Unibo-MatchSkills.docx
+++ b/docs/Unibo-MatchSkills.docx
@@ -1803,7 +1803,10 @@
     </w:p>
     <w:p>
       <w:pPr>
-        <w:pStyle w:val="Titolo2"/>
+        <w:pStyle w:val="Paragrafoelenco"/>
+        <w:rPr>
+          <w:lang w:val="en-GB"/>
+        </w:rPr>
       </w:pPr>
     </w:p>
     <w:p>
@@ -1831,26 +1834,6 @@
           <w:b/>
           <w:bCs/>
         </w:rPr>
-        <w:t>Integrare Composer</w:t>
-      </w:r>
-    </w:p>
-    <w:p>
-      <w:pPr>
-        <w:pStyle w:val="Paragrafoelenco"/>
-        <w:numPr>
-          <w:ilvl w:val="0"/>
-          <w:numId w:val="37"/>
-        </w:numPr>
-        <w:rPr>
-          <w:b/>
-          <w:bCs/>
-        </w:rPr>
-      </w:pPr>
-      <w:r>
-        <w:rPr>
-          <w:b/>
-          <w:bCs/>
-        </w:rPr>
         <w:t>[</w:t>
       </w:r>
       <w:r>
@@ -1898,6 +1881,28 @@
       </w:pPr>
       <w:r>
         <w:t>DATABASE</w:t>
+      </w:r>
+    </w:p>
+    <w:p>
+      <w:pPr>
+        <w:pStyle w:val="Paragrafoelenco"/>
+        <w:rPr>
+          <w:lang w:val="en-GB"/>
+        </w:rPr>
+      </w:pPr>
+    </w:p>
+    <w:p>
+      <w:pPr>
+        <w:pStyle w:val="Titolo2"/>
+        <w:rPr>
+          <w:lang w:val="en-GB"/>
+        </w:rPr>
+      </w:pPr>
+      <w:r>
+        <w:rPr>
+          <w:lang w:val="en-GB"/>
+        </w:rPr>
+        <w:t>EXAMPLES</w:t>
       </w:r>
     </w:p>
     <w:p>
@@ -1907,109 +1912,11 @@
           <w:ilvl w:val="0"/>
           <w:numId w:val="36"/>
         </w:numPr>
-      </w:pPr>
-      <w:r>
-        <w:rPr>
-          <w:b/>
-          <w:bCs/>
-        </w:rPr>
-        <w:t>Integrare</w:t>
-      </w:r>
-      <w:r>
-        <w:t xml:space="preserve"> </w:t>
-      </w:r>
-      <w:r>
-        <w:rPr>
-          <w:b/>
-          <w:bCs/>
-        </w:rPr>
-        <w:t xml:space="preserve">nella </w:t>
-      </w:r>
-      <w:r>
-        <w:rPr>
-          <w:b/>
-          <w:bCs/>
-        </w:rPr>
-        <w:t>repo</w:t>
-      </w:r>
-      <w:r>
-        <w:t xml:space="preserve">: </w:t>
-      </w:r>
+        <w:rPr>
+          <w:lang w:val="en-GB"/>
+        </w:rPr>
+      </w:pPr>
       <w:hyperlink r:id="rId10" w:history="1">
-        <w:r>
-          <w:rPr>
-            <w:rStyle w:val="Collegamentoipertestuale"/>
-          </w:rPr>
-          <w:t>https://github.com/cakephp/phinx</w:t>
-        </w:r>
-      </w:hyperlink>
-    </w:p>
-    <w:p/>
-    <w:p>
-      <w:pPr>
-        <w:pStyle w:val="Titolo2"/>
-        <w:rPr>
-          <w:lang w:val="en-GB"/>
-        </w:rPr>
-      </w:pPr>
-      <w:r>
-        <w:rPr>
-          <w:lang w:val="en-GB"/>
-        </w:rPr>
-        <w:t>PERSONAS E SCENARIOS</w:t>
-      </w:r>
-    </w:p>
-    <w:p>
-      <w:pPr>
-        <w:pStyle w:val="Paragrafoelenco"/>
-        <w:numPr>
-          <w:ilvl w:val="0"/>
-          <w:numId w:val="36"/>
-        </w:numPr>
-        <w:rPr>
-          <w:lang w:val="en-GB"/>
-        </w:rPr>
-      </w:pPr>
-      <w:r>
-        <w:rPr>
-          <w:lang w:val="en-GB"/>
-        </w:rPr>
-        <w:t>Con Figma o Canva</w:t>
-      </w:r>
-    </w:p>
-    <w:p>
-      <w:pPr>
-        <w:rPr>
-          <w:lang w:val="en-GB"/>
-        </w:rPr>
-      </w:pPr>
-    </w:p>
-    <w:p>
-      <w:pPr>
-        <w:pStyle w:val="Titolo2"/>
-        <w:rPr>
-          <w:lang w:val="en-GB"/>
-        </w:rPr>
-      </w:pPr>
-      <w:r>
-        <w:rPr>
-          <w:lang w:val="en-GB"/>
-        </w:rPr>
-        <w:t>EXAMPLES</w:t>
-      </w:r>
-    </w:p>
-    <w:p>
-      <w:pPr>
-        <w:pStyle w:val="Paragrafoelenco"/>
-        <w:numPr>
-          <w:ilvl w:val="0"/>
-          <w:numId w:val="36"/>
-        </w:numPr>
-        <w:rPr>
-          <w:lang w:val="en-GB"/>
-        </w:rPr>
-      </w:pPr>
-      <w:hyperlink r:id="rId11" w:history="1">
         <w:r>
           <w:rPr>
             <w:rStyle w:val="Collegamentoipertestuale"/>
@@ -2030,7 +1937,7 @@
           <w:lang w:val="en-GB"/>
         </w:rPr>
       </w:pPr>
-      <w:hyperlink r:id="rId12" w:history="1">
+      <w:hyperlink r:id="rId11" w:history="1">
         <w:r>
           <w:rPr>
             <w:rStyle w:val="Collegamentoipertestuale"/>
@@ -2168,7 +2075,21 @@
         <w:rPr>
           <w:lang w:val="en-GB"/>
         </w:rPr>
-        <w:t>TODO Mancio: Requests su DB (con inbox)</w:t>
+        <w:t xml:space="preserve">TODO Mancio: Requests </w:t>
+      </w:r>
+      <w:proofErr w:type="spellStart"/>
+      <w:r>
+        <w:rPr>
+          <w:lang w:val="en-GB"/>
+        </w:rPr>
+        <w:t>su</w:t>
+      </w:r>
+      <w:proofErr w:type="spellEnd"/>
+      <w:r>
+        <w:rPr>
+          <w:lang w:val="en-GB"/>
+        </w:rPr>
+        <w:t xml:space="preserve"> DB (con inbox)</w:t>
       </w:r>
     </w:p>
     <w:p>
@@ -2221,6 +2142,7 @@
         <w:t xml:space="preserve">Send email of </w:t>
       </w:r>
       <w:proofErr w:type="spellStart"/>
+      <w:proofErr w:type="gramStart"/>
       <w:r>
         <w:rPr>
           <w:lang w:val="en-GB"/>
@@ -2241,6 +2163,7 @@
         <w:t xml:space="preserve">  (</w:t>
       </w:r>
       <w:proofErr w:type="spellStart"/>
+      <w:proofErr w:type="gramEnd"/>
       <w:r>
         <w:rPr>
           <w:lang w:val="en-GB"/>
@@ -2451,12 +2374,12 @@
 <w:numbering xmlns:wpc="http://schemas.microsoft.com/office/word/2010/wordprocessingCanvas" xmlns:cx="http://schemas.microsoft.com/office/drawing/2014/chartex" xmlns:cx1="http://schemas.microsoft.com/office/drawing/2015/9/8/chartex" xmlns:cx2="http://schemas.microsoft.com/office/drawing/2015/10/21/chartex" xmlns:cx3="http://schemas.microsoft.com/office/drawing/2016/5/9/chartex" xmlns:cx4="http://schemas.microsoft.com/office/drawing/2016/5/10/chartex" xmlns:cx5="http://schemas.microsoft.com/office/drawing/2016/5/11/chartex" xmlns:cx6="http://schemas.microsoft.com/office/drawing/2016/5/12/chartex" xmlns:cx7="http://schemas.microsoft.com/office/drawing/2016/5/13/chartex" xmlns:cx8="http://schemas.microsoft.com/office/drawing/2016/5/14/chartex" xmlns:mc="http://schemas.openxmlformats.org/markup-compatibility/2006" xmlns:aink="http://schemas.microsoft.com/office/drawing/2016/ink" xmlns:am3d="http://schemas.microsoft.com/office/drawing/2017/model3d" xmlns:o="urn:schemas-microsoft-com:office:office" xmlns:oel="http://schemas.microsoft.com/office/2019/extlst" xmlns:r="http://schemas.openxmlformats.org/officeDocument/2006/relationships" xmlns:m="http://schemas.openxmlformats.org/officeDocument/2006/math" xmlns:v="urn:schemas-microsoft-com:vml" xmlns:wp14="http://schemas.microsoft.com/office/word/2010/wordprocessingDrawing" xmlns:wp="http://schemas.openxmlformats.org/drawingml/2006/wordprocessingDrawing" xmlns:w10="urn:schemas-microsoft-com:office:word" xmlns:w="http://schemas.openxmlformats.org/wordprocessingml/2006/main" xmlns:w14="http://schemas.microsoft.com/office/word/2010/wordml" xmlns:w15="http://schemas.microsoft.com/office/word/2012/wordml" xmlns:w16cex="http://schemas.microsoft.com/office/word/2018/wordml/cex" xmlns:w16cid="http://schemas.microsoft.com/office/word/2016/wordml/cid" xmlns:w16="http://schemas.microsoft.com/office/word/2018/wordml" xmlns:w16du="http://schemas.microsoft.com/office/word/2023/wordml/word16du" xmlns:w16sdtdh="http://schemas.microsoft.com/office/word/2020/wordml/sdtdatahash" xmlns:w16sdtfl="http://schemas.microsoft.com/office/word/2024/wordml/sdtformatlock" xmlns:w16se="http://schemas.microsoft.com/office/word/2015/wordml/symex" xmlns:wpg="http://schemas.microsoft.com/office/word/2010/wordprocessingGroup" xmlns:wpi="http://schemas.microsoft.com/office/word/2010/wordprocessingInk" xmlns:wne="http://schemas.microsoft.com/office/word/2006/wordml" xmlns:wps="http://schemas.microsoft.com/office/word/2010/wordprocessingShape" mc:Ignorable="w14 w15 w16se w16cid w16 w16cex w16sdtdh w16sdtfl w16du wp14">
   <w:numPicBullet w:numPicBulletId="0">
     <w:pict>
-      <v:rect id="_x0000_i1038" style="width:0;height:1.5pt" o:hralign="center" o:bullet="t" o:hrstd="t" o:hr="t" fillcolor="#a0a0a0" stroked="f"/>
+      <v:rect id="_x0000_i1032" style="width:0;height:1.5pt" o:hralign="center" o:bullet="t" o:hrstd="t" o:hr="t" fillcolor="#a0a0a0" stroked="f"/>
     </w:pict>
   </w:numPicBullet>
   <w:numPicBullet w:numPicBulletId="1">
     <w:pict>
-      <v:rect id="_x0000_i1039" style="width:0;height:1.5pt" o:hralign="center" o:bullet="t" o:hrstd="t" o:hr="t" fillcolor="#a0a0a0" stroked="f"/>
+      <v:rect id="_x0000_i1033" style="width:0;height:1.5pt" o:hralign="center" o:bullet="t" o:hrstd="t" o:hr="t" fillcolor="#a0a0a0" stroked="f"/>
     </w:pict>
   </w:numPicBullet>
   <w:abstractNum w:abstractNumId="0" w15:restartNumberingAfterBreak="0">

</xml_diff>

<commit_message>
Migrations for events. and Team table. Seeders.
</commit_message>
<xml_diff>
--- a/docs/Unibo-MatchSkills.docx
+++ b/docs/Unibo-MatchSkills.docx
@@ -1885,23 +1885,529 @@
     </w:p>
     <w:p>
       <w:pPr>
-        <w:pStyle w:val="Paragrafoelenco"/>
-        <w:rPr>
-          <w:lang w:val="en-GB"/>
-        </w:rPr>
-      </w:pPr>
+        <w:pStyle w:val="Titolo3"/>
+        <w:rPr>
+          <w:lang w:val="en-GB"/>
+        </w:rPr>
+      </w:pPr>
+      <w:proofErr w:type="spellStart"/>
+      <w:r>
+        <w:rPr>
+          <w:lang w:val="en-GB"/>
+        </w:rPr>
+        <w:t>Migrazioni</w:t>
+      </w:r>
+      <w:proofErr w:type="spellEnd"/>
+    </w:p>
+    <w:p>
+      <w:pPr>
+        <w:spacing w:after="0"/>
+      </w:pPr>
+      <w:r>
+        <w:t>Creare una nuova migrazione</w:t>
+      </w:r>
+    </w:p>
+    <w:p>
+      <w:pPr>
+        <w:spacing w:after="0"/>
+        <w:rPr>
+          <w:lang w:val="en-GB"/>
+        </w:rPr>
+      </w:pPr>
+      <w:r>
+        <w:rPr>
+          <w:lang w:val="en-GB"/>
+        </w:rPr>
+        <w:t>vendor\bin\</w:t>
+      </w:r>
+      <w:proofErr w:type="spellStart"/>
+      <w:r>
+        <w:rPr>
+          <w:lang w:val="en-GB"/>
+        </w:rPr>
+        <w:t>phinx</w:t>
+      </w:r>
+      <w:proofErr w:type="spellEnd"/>
+      <w:r>
+        <w:rPr>
+          <w:lang w:val="en-GB"/>
+        </w:rPr>
+        <w:t xml:space="preserve"> create </w:t>
+      </w:r>
+      <w:proofErr w:type="spellStart"/>
+      <w:r>
+        <w:rPr>
+          <w:lang w:val="en-GB"/>
+        </w:rPr>
+        <w:t>CreateEventParticipationTable</w:t>
+      </w:r>
+      <w:proofErr w:type="spellEnd"/>
+      <w:r>
+        <w:rPr>
+          <w:lang w:val="en-GB"/>
+        </w:rPr>
+        <w:t xml:space="preserve"> -c config\</w:t>
+      </w:r>
+      <w:proofErr w:type="spellStart"/>
+      <w:r>
+        <w:rPr>
+          <w:lang w:val="en-GB"/>
+        </w:rPr>
+        <w:t>phinx.php</w:t>
+      </w:r>
+      <w:proofErr w:type="spellEnd"/>
+    </w:p>
+    <w:p>
+      <w:pPr>
+        <w:spacing w:after="0"/>
+        <w:rPr>
+          <w:lang w:val="en-GB"/>
+        </w:rPr>
+      </w:pPr>
+    </w:p>
+    <w:p>
+      <w:pPr>
+        <w:spacing w:after="0"/>
+      </w:pPr>
+      <w:r>
+        <w:t>Vedere lo stato delle migrazioni</w:t>
+      </w:r>
+    </w:p>
+    <w:p>
+      <w:pPr>
+        <w:spacing w:after="0"/>
+      </w:pPr>
+      <w:proofErr w:type="spellStart"/>
+      <w:r>
+        <w:t>vendor</w:t>
+      </w:r>
+      <w:proofErr w:type="spellEnd"/>
+      <w:r>
+        <w:t>\bin\</w:t>
+      </w:r>
+      <w:proofErr w:type="spellStart"/>
+      <w:r>
+        <w:t>phinx</w:t>
+      </w:r>
+      <w:proofErr w:type="spellEnd"/>
+      <w:r>
+        <w:t xml:space="preserve"> status -c </w:t>
+      </w:r>
+      <w:proofErr w:type="spellStart"/>
+      <w:r>
+        <w:t>config</w:t>
+      </w:r>
+      <w:proofErr w:type="spellEnd"/>
+      <w:r>
+        <w:t>\</w:t>
+      </w:r>
+      <w:proofErr w:type="spellStart"/>
+      <w:r>
+        <w:t>phinx.php</w:t>
+      </w:r>
+      <w:proofErr w:type="spellEnd"/>
+    </w:p>
+    <w:p>
+      <w:pPr>
+        <w:spacing w:after="0"/>
+      </w:pPr>
+    </w:p>
+    <w:p>
+      <w:pPr>
+        <w:spacing w:after="0"/>
+      </w:pPr>
+      <w:r>
+        <w:t>Eseguire le migrazioni</w:t>
+      </w:r>
+    </w:p>
+    <w:p>
+      <w:pPr>
+        <w:spacing w:after="0"/>
+      </w:pPr>
+      <w:proofErr w:type="spellStart"/>
+      <w:r>
+        <w:t>vendor</w:t>
+      </w:r>
+      <w:proofErr w:type="spellEnd"/>
+      <w:r>
+        <w:t>\bin\</w:t>
+      </w:r>
+      <w:proofErr w:type="spellStart"/>
+      <w:r>
+        <w:t>phinx</w:t>
+      </w:r>
+      <w:proofErr w:type="spellEnd"/>
+      <w:r>
+        <w:t xml:space="preserve"> migrate -c </w:t>
+      </w:r>
+      <w:proofErr w:type="spellStart"/>
+      <w:r>
+        <w:t>config</w:t>
+      </w:r>
+      <w:proofErr w:type="spellEnd"/>
+      <w:r>
+        <w:t>\</w:t>
+      </w:r>
+      <w:proofErr w:type="spellStart"/>
+      <w:r>
+        <w:t>phinx.php</w:t>
+      </w:r>
+      <w:proofErr w:type="spellEnd"/>
+    </w:p>
+    <w:p>
+      <w:pPr>
+        <w:spacing w:after="0"/>
+      </w:pPr>
+    </w:p>
+    <w:p>
+      <w:pPr>
+        <w:spacing w:after="0"/>
+      </w:pPr>
+      <w:r>
+        <w:t xml:space="preserve">Fare </w:t>
+      </w:r>
+      <w:proofErr w:type="spellStart"/>
+      <w:r>
+        <w:t>rollback</w:t>
+      </w:r>
+      <w:proofErr w:type="spellEnd"/>
+      <w:r>
+        <w:t xml:space="preserve"> a una versione specifica</w:t>
+      </w:r>
+    </w:p>
+    <w:p>
+      <w:pPr>
+        <w:spacing w:after="0"/>
+        <w:rPr>
+          <w:lang w:val="en-GB"/>
+        </w:rPr>
+      </w:pPr>
+      <w:r>
+        <w:rPr>
+          <w:lang w:val="en-GB"/>
+        </w:rPr>
+        <w:t>vendor\bin\</w:t>
+      </w:r>
+      <w:proofErr w:type="spellStart"/>
+      <w:r>
+        <w:rPr>
+          <w:lang w:val="en-GB"/>
+        </w:rPr>
+        <w:t>phinx</w:t>
+      </w:r>
+      <w:proofErr w:type="spellEnd"/>
+      <w:r>
+        <w:rPr>
+          <w:lang w:val="en-GB"/>
+        </w:rPr>
+        <w:t xml:space="preserve"> rollback -t 20260101000100 -c config\</w:t>
+      </w:r>
+      <w:proofErr w:type="spellStart"/>
+      <w:r>
+        <w:rPr>
+          <w:lang w:val="en-GB"/>
+        </w:rPr>
+        <w:t>phinx.php</w:t>
+      </w:r>
+      <w:proofErr w:type="spellEnd"/>
+    </w:p>
+    <w:p>
+      <w:pPr>
+        <w:spacing w:after="0"/>
+        <w:rPr>
+          <w:lang w:val="en-GB"/>
+        </w:rPr>
+      </w:pPr>
+    </w:p>
+    <w:p>
+      <w:pPr>
+        <w:spacing w:after="0"/>
+      </w:pPr>
+      <w:r>
+        <w:t>Creare u</w:t>
+      </w:r>
+      <w:r>
+        <w:t xml:space="preserve">n </w:t>
+      </w:r>
+      <w:proofErr w:type="spellStart"/>
+      <w:r>
+        <w:t>seeder</w:t>
+      </w:r>
+      <w:proofErr w:type="spellEnd"/>
+    </w:p>
+    <w:p>
+      <w:pPr>
+        <w:spacing w:after="0"/>
+        <w:rPr>
+          <w:lang w:val="en-GB"/>
+        </w:rPr>
+      </w:pPr>
+      <w:proofErr w:type="spellStart"/>
+      <w:r>
+        <w:rPr>
+          <w:lang w:val="en-GB"/>
+        </w:rPr>
+        <w:t>php</w:t>
+      </w:r>
+      <w:proofErr w:type="spellEnd"/>
+      <w:r>
+        <w:rPr>
+          <w:lang w:val="en-GB"/>
+        </w:rPr>
+        <w:t xml:space="preserve"> vendor\bin\</w:t>
+      </w:r>
+      <w:proofErr w:type="spellStart"/>
+      <w:r>
+        <w:rPr>
+          <w:lang w:val="en-GB"/>
+        </w:rPr>
+        <w:t>phinx</w:t>
+      </w:r>
+      <w:proofErr w:type="spellEnd"/>
+      <w:r>
+        <w:rPr>
+          <w:lang w:val="en-GB"/>
+        </w:rPr>
+        <w:t xml:space="preserve"> </w:t>
+      </w:r>
+      <w:proofErr w:type="spellStart"/>
+      <w:proofErr w:type="gramStart"/>
+      <w:r>
+        <w:rPr>
+          <w:lang w:val="en-GB"/>
+        </w:rPr>
+        <w:t>seed:create</w:t>
+      </w:r>
+      <w:proofErr w:type="spellEnd"/>
+      <w:proofErr w:type="gramEnd"/>
+      <w:r>
+        <w:rPr>
+          <w:lang w:val="en-GB"/>
+        </w:rPr>
+        <w:t xml:space="preserve"> </w:t>
+      </w:r>
+      <w:proofErr w:type="spellStart"/>
+      <w:r>
+        <w:rPr>
+          <w:lang w:val="en-GB"/>
+        </w:rPr>
+        <w:t>EventSeeder</w:t>
+      </w:r>
+      <w:proofErr w:type="spellEnd"/>
+      <w:r>
+        <w:rPr>
+          <w:lang w:val="en-GB"/>
+        </w:rPr>
+        <w:t xml:space="preserve"> -c config\</w:t>
+      </w:r>
+      <w:proofErr w:type="spellStart"/>
+      <w:r>
+        <w:rPr>
+          <w:lang w:val="en-GB"/>
+        </w:rPr>
+        <w:t>phinx.php</w:t>
+      </w:r>
+      <w:proofErr w:type="spellEnd"/>
+    </w:p>
+    <w:p>
+      <w:pPr>
+        <w:spacing w:after="0"/>
+        <w:rPr>
+          <w:lang w:val="en-GB"/>
+        </w:rPr>
+      </w:pPr>
+    </w:p>
+    <w:p>
+      <w:pPr>
+        <w:spacing w:after="0"/>
+      </w:pPr>
+      <w:r>
+        <w:t xml:space="preserve">Eseguire i </w:t>
+      </w:r>
+      <w:proofErr w:type="spellStart"/>
+      <w:r>
+        <w:t>seeders</w:t>
+      </w:r>
+      <w:proofErr w:type="spellEnd"/>
+    </w:p>
+    <w:p>
+      <w:pPr>
+        <w:spacing w:after="0"/>
+        <w:rPr>
+          <w:lang w:val="en-GB"/>
+        </w:rPr>
+      </w:pPr>
+      <w:proofErr w:type="spellStart"/>
+      <w:r>
+        <w:rPr>
+          <w:lang w:val="en-GB"/>
+        </w:rPr>
+        <w:t>php</w:t>
+      </w:r>
+      <w:proofErr w:type="spellEnd"/>
+      <w:r>
+        <w:rPr>
+          <w:lang w:val="en-GB"/>
+        </w:rPr>
+        <w:t xml:space="preserve"> vendor\bin\</w:t>
+      </w:r>
+      <w:proofErr w:type="spellStart"/>
+      <w:r>
+        <w:rPr>
+          <w:lang w:val="en-GB"/>
+        </w:rPr>
+        <w:t>phinx</w:t>
+      </w:r>
+      <w:proofErr w:type="spellEnd"/>
+      <w:r>
+        <w:rPr>
+          <w:lang w:val="en-GB"/>
+        </w:rPr>
+        <w:t xml:space="preserve"> </w:t>
+      </w:r>
+      <w:proofErr w:type="spellStart"/>
+      <w:proofErr w:type="gramStart"/>
+      <w:r>
+        <w:rPr>
+          <w:lang w:val="en-GB"/>
+        </w:rPr>
+        <w:t>seed:run</w:t>
+      </w:r>
+      <w:proofErr w:type="spellEnd"/>
+      <w:proofErr w:type="gramEnd"/>
+      <w:r>
+        <w:rPr>
+          <w:lang w:val="en-GB"/>
+        </w:rPr>
+        <w:t xml:space="preserve"> -c config\</w:t>
+      </w:r>
+      <w:proofErr w:type="spellStart"/>
+      <w:r>
+        <w:rPr>
+          <w:lang w:val="en-GB"/>
+        </w:rPr>
+        <w:t>phinx.php</w:t>
+      </w:r>
+      <w:proofErr w:type="spellEnd"/>
+    </w:p>
+    <w:p>
+      <w:pPr>
+        <w:spacing w:after="0"/>
+        <w:rPr>
+          <w:lang w:val="en-GB"/>
+        </w:rPr>
+      </w:pPr>
+    </w:p>
+    <w:p>
+      <w:pPr>
+        <w:spacing w:after="0"/>
+      </w:pPr>
+      <w:r>
+        <w:t xml:space="preserve">Eseguire </w:t>
+      </w:r>
+      <w:proofErr w:type="gramStart"/>
+      <w:r>
+        <w:t>un</w:t>
+      </w:r>
+      <w:proofErr w:type="gramEnd"/>
+      <w:r>
+        <w:t xml:space="preserve"> specifico </w:t>
+      </w:r>
+      <w:proofErr w:type="spellStart"/>
+      <w:r>
+        <w:t>s</w:t>
+      </w:r>
+      <w:r>
+        <w:t>eeder</w:t>
+      </w:r>
+      <w:proofErr w:type="spellEnd"/>
+    </w:p>
+    <w:p>
+      <w:pPr>
+        <w:spacing w:after="0"/>
+        <w:rPr>
+          <w:lang w:val="en-GB"/>
+        </w:rPr>
+      </w:pPr>
+      <w:proofErr w:type="spellStart"/>
+      <w:r>
+        <w:rPr>
+          <w:lang w:val="en-GB"/>
+        </w:rPr>
+        <w:t>php</w:t>
+      </w:r>
+      <w:proofErr w:type="spellEnd"/>
+      <w:r>
+        <w:rPr>
+          <w:lang w:val="en-GB"/>
+        </w:rPr>
+        <w:t xml:space="preserve"> vendor\bin\</w:t>
+      </w:r>
+      <w:proofErr w:type="spellStart"/>
+      <w:r>
+        <w:rPr>
+          <w:lang w:val="en-GB"/>
+        </w:rPr>
+        <w:t>phinx</w:t>
+      </w:r>
+      <w:proofErr w:type="spellEnd"/>
+      <w:r>
+        <w:rPr>
+          <w:lang w:val="en-GB"/>
+        </w:rPr>
+        <w:t xml:space="preserve"> </w:t>
+      </w:r>
+      <w:proofErr w:type="spellStart"/>
+      <w:proofErr w:type="gramStart"/>
+      <w:r>
+        <w:rPr>
+          <w:lang w:val="en-GB"/>
+        </w:rPr>
+        <w:t>seed:run</w:t>
+      </w:r>
+      <w:proofErr w:type="spellEnd"/>
+      <w:proofErr w:type="gramEnd"/>
+      <w:r>
+        <w:rPr>
+          <w:lang w:val="en-GB"/>
+        </w:rPr>
+        <w:t xml:space="preserve"> -s </w:t>
+      </w:r>
+      <w:proofErr w:type="spellStart"/>
+      <w:r>
+        <w:rPr>
+          <w:lang w:val="en-GB"/>
+        </w:rPr>
+        <w:t>EventSeeder</w:t>
+      </w:r>
+      <w:proofErr w:type="spellEnd"/>
+      <w:r>
+        <w:rPr>
+          <w:lang w:val="en-GB"/>
+        </w:rPr>
+        <w:t xml:space="preserve"> </w:t>
+      </w:r>
+      <w:r>
+        <w:rPr>
+          <w:lang w:val="en-GB"/>
+        </w:rPr>
+        <w:t>-c config\</w:t>
+      </w:r>
+      <w:proofErr w:type="spellStart"/>
+      <w:r>
+        <w:rPr>
+          <w:lang w:val="en-GB"/>
+        </w:rPr>
+        <w:t>phinx.php</w:t>
+      </w:r>
+      <w:proofErr w:type="spellEnd"/>
     </w:p>
     <w:p>
       <w:pPr>
         <w:pStyle w:val="Titolo2"/>
-        <w:rPr>
-          <w:lang w:val="en-GB"/>
-        </w:rPr>
-      </w:pPr>
-      <w:r>
-        <w:rPr>
-          <w:lang w:val="en-GB"/>
-        </w:rPr>
+      </w:pPr>
+      <w:r>
+        <w:lastRenderedPageBreak/>
         <w:t>EXAMPLES</w:t>
       </w:r>
     </w:p>
@@ -2374,12 +2880,12 @@
 <w:numbering xmlns:wpc="http://schemas.microsoft.com/office/word/2010/wordprocessingCanvas" xmlns:cx="http://schemas.microsoft.com/office/drawing/2014/chartex" xmlns:cx1="http://schemas.microsoft.com/office/drawing/2015/9/8/chartex" xmlns:cx2="http://schemas.microsoft.com/office/drawing/2015/10/21/chartex" xmlns:cx3="http://schemas.microsoft.com/office/drawing/2016/5/9/chartex" xmlns:cx4="http://schemas.microsoft.com/office/drawing/2016/5/10/chartex" xmlns:cx5="http://schemas.microsoft.com/office/drawing/2016/5/11/chartex" xmlns:cx6="http://schemas.microsoft.com/office/drawing/2016/5/12/chartex" xmlns:cx7="http://schemas.microsoft.com/office/drawing/2016/5/13/chartex" xmlns:cx8="http://schemas.microsoft.com/office/drawing/2016/5/14/chartex" xmlns:mc="http://schemas.openxmlformats.org/markup-compatibility/2006" xmlns:aink="http://schemas.microsoft.com/office/drawing/2016/ink" xmlns:am3d="http://schemas.microsoft.com/office/drawing/2017/model3d" xmlns:o="urn:schemas-microsoft-com:office:office" xmlns:oel="http://schemas.microsoft.com/office/2019/extlst" xmlns:r="http://schemas.openxmlformats.org/officeDocument/2006/relationships" xmlns:m="http://schemas.openxmlformats.org/officeDocument/2006/math" xmlns:v="urn:schemas-microsoft-com:vml" xmlns:wp14="http://schemas.microsoft.com/office/word/2010/wordprocessingDrawing" xmlns:wp="http://schemas.openxmlformats.org/drawingml/2006/wordprocessingDrawing" xmlns:w10="urn:schemas-microsoft-com:office:word" xmlns:w="http://schemas.openxmlformats.org/wordprocessingml/2006/main" xmlns:w14="http://schemas.microsoft.com/office/word/2010/wordml" xmlns:w15="http://schemas.microsoft.com/office/word/2012/wordml" xmlns:w16cex="http://schemas.microsoft.com/office/word/2018/wordml/cex" xmlns:w16cid="http://schemas.microsoft.com/office/word/2016/wordml/cid" xmlns:w16="http://schemas.microsoft.com/office/word/2018/wordml" xmlns:w16du="http://schemas.microsoft.com/office/word/2023/wordml/word16du" xmlns:w16sdtdh="http://schemas.microsoft.com/office/word/2020/wordml/sdtdatahash" xmlns:w16sdtfl="http://schemas.microsoft.com/office/word/2024/wordml/sdtformatlock" xmlns:w16se="http://schemas.microsoft.com/office/word/2015/wordml/symex" xmlns:wpg="http://schemas.microsoft.com/office/word/2010/wordprocessingGroup" xmlns:wpi="http://schemas.microsoft.com/office/word/2010/wordprocessingInk" xmlns:wne="http://schemas.microsoft.com/office/word/2006/wordml" xmlns:wps="http://schemas.microsoft.com/office/word/2010/wordprocessingShape" mc:Ignorable="w14 w15 w16se w16cid w16 w16cex w16sdtdh w16sdtfl w16du wp14">
   <w:numPicBullet w:numPicBulletId="0">
     <w:pict>
-      <v:rect id="_x0000_i1032" style="width:0;height:1.5pt" o:hralign="center" o:bullet="t" o:hrstd="t" o:hr="t" fillcolor="#a0a0a0" stroked="f"/>
+      <v:rect id="_x0000_i1036" style="width:0;height:1.5pt" o:hralign="center" o:bullet="t" o:hrstd="t" o:hr="t" fillcolor="#a0a0a0" stroked="f"/>
     </w:pict>
   </w:numPicBullet>
   <w:numPicBullet w:numPicBulletId="1">
     <w:pict>
-      <v:rect id="_x0000_i1033" style="width:0;height:1.5pt" o:hralign="center" o:bullet="t" o:hrstd="t" o:hr="t" fillcolor="#a0a0a0" stroked="f"/>
+      <v:rect id="_x0000_i1037" style="width:0;height:1.5pt" o:hralign="center" o:bullet="t" o:hrstd="t" o:hr="t" fillcolor="#a0a0a0" stroked="f"/>
     </w:pict>
   </w:numPicBullet>
   <w:abstractNum w:abstractNumId="0" w15:restartNumberingAfterBreak="0">
@@ -8383,7 +8889,6 @@
     <w:next w:val="Normale"/>
     <w:link w:val="Titolo3Carattere"/>
     <w:uiPriority w:val="9"/>
-    <w:semiHidden/>
     <w:unhideWhenUsed/>
     <w:qFormat/>
     <w:rsid w:val="002A5D1A"/>
@@ -8590,7 +9095,6 @@
     <w:basedOn w:val="Carpredefinitoparagrafo"/>
     <w:link w:val="Titolo3"/>
     <w:uiPriority w:val="9"/>
-    <w:semiHidden/>
     <w:rsid w:val="002A5D1A"/>
     <w:rPr>
       <w:rFonts w:eastAsiaTheme="majorEastAsia" w:cstheme="majorBidi"/>

</xml_diff>

<commit_message>
Updated db in docs. Deleted mentor_id from Team.
</commit_message>
<xml_diff>
--- a/docs/Unibo-MatchSkills.docx
+++ b/docs/Unibo-MatchSkills.docx
@@ -1902,8 +1902,16 @@
     <w:p>
       <w:pPr>
         <w:spacing w:after="0"/>
-      </w:pPr>
-      <w:r>
+        <w:rPr>
+          <w:b/>
+          <w:bCs/>
+        </w:rPr>
+      </w:pPr>
+      <w:r>
+        <w:rPr>
+          <w:b/>
+          <w:bCs/>
+        </w:rPr>
         <w:t>Creare una nuova migrazione</w:t>
       </w:r>
     </w:p>
@@ -1939,14 +1947,20 @@
         <w:rPr>
           <w:lang w:val="en-GB"/>
         </w:rPr>
-        <w:t>CreateEventParticipationTable</w:t>
+        <w:t>AddAccessTypeToEvent</w:t>
       </w:r>
       <w:proofErr w:type="spellEnd"/>
       <w:r>
         <w:rPr>
           <w:lang w:val="en-GB"/>
         </w:rPr>
-        <w:t xml:space="preserve"> -c config\</w:t>
+        <w:t xml:space="preserve"> </w:t>
+      </w:r>
+      <w:r>
+        <w:rPr>
+          <w:lang w:val="en-GB"/>
+        </w:rPr>
+        <w:t>-c config\</w:t>
       </w:r>
       <w:proofErr w:type="spellStart"/>
       <w:r>
@@ -1968,8 +1982,16 @@
     <w:p>
       <w:pPr>
         <w:spacing w:after="0"/>
-      </w:pPr>
-      <w:r>
+        <w:rPr>
+          <w:b/>
+          <w:bCs/>
+        </w:rPr>
+      </w:pPr>
+      <w:r>
+        <w:rPr>
+          <w:b/>
+          <w:bCs/>
+        </w:rPr>
         <w:t>Vedere lo stato delle migrazioni</w:t>
       </w:r>
     </w:p>
@@ -2015,8 +2037,16 @@
     <w:p>
       <w:pPr>
         <w:spacing w:after="0"/>
-      </w:pPr>
-      <w:r>
+        <w:rPr>
+          <w:b/>
+          <w:bCs/>
+        </w:rPr>
+      </w:pPr>
+      <w:r>
+        <w:rPr>
+          <w:b/>
+          <w:bCs/>
+        </w:rPr>
         <w:t>Eseguire le migrazioni</w:t>
       </w:r>
     </w:p>
@@ -2062,16 +2092,32 @@
     <w:p>
       <w:pPr>
         <w:spacing w:after="0"/>
-      </w:pPr>
-      <w:r>
+        <w:rPr>
+          <w:b/>
+          <w:bCs/>
+        </w:rPr>
+      </w:pPr>
+      <w:r>
+        <w:rPr>
+          <w:b/>
+          <w:bCs/>
+        </w:rPr>
         <w:t xml:space="preserve">Fare </w:t>
       </w:r>
       <w:proofErr w:type="spellStart"/>
       <w:r>
+        <w:rPr>
+          <w:b/>
+          <w:bCs/>
+        </w:rPr>
         <w:t>rollback</w:t>
       </w:r>
       <w:proofErr w:type="spellEnd"/>
       <w:r>
+        <w:rPr>
+          <w:b/>
+          <w:bCs/>
+        </w:rPr>
         <w:t xml:space="preserve"> a una versione specifica</w:t>
       </w:r>
     </w:p>
@@ -2122,15 +2168,24 @@
     <w:p>
       <w:pPr>
         <w:spacing w:after="0"/>
-      </w:pPr>
-      <w:r>
-        <w:t>Creare u</w:t>
-      </w:r>
-      <w:r>
-        <w:t xml:space="preserve">n </w:t>
+        <w:rPr>
+          <w:b/>
+          <w:bCs/>
+        </w:rPr>
+      </w:pPr>
+      <w:r>
+        <w:rPr>
+          <w:b/>
+          <w:bCs/>
+        </w:rPr>
+        <w:t xml:space="preserve">Creare un </w:t>
       </w:r>
       <w:proofErr w:type="spellStart"/>
       <w:r>
+        <w:rPr>
+          <w:b/>
+          <w:bCs/>
+        </w:rPr>
         <w:t>seeder</w:t>
       </w:r>
       <w:proofErr w:type="spellEnd"/>
@@ -2220,12 +2275,24 @@
     <w:p>
       <w:pPr>
         <w:spacing w:after="0"/>
-      </w:pPr>
-      <w:r>
+        <w:rPr>
+          <w:b/>
+          <w:bCs/>
+        </w:rPr>
+      </w:pPr>
+      <w:r>
+        <w:rPr>
+          <w:b/>
+          <w:bCs/>
+        </w:rPr>
         <w:t xml:space="preserve">Eseguire i </w:t>
       </w:r>
       <w:proofErr w:type="spellStart"/>
       <w:r>
+        <w:rPr>
+          <w:b/>
+          <w:bCs/>
+        </w:rPr>
         <w:t>seeders</w:t>
       </w:r>
       <w:proofErr w:type="spellEnd"/>
@@ -2301,24 +2368,56 @@
     <w:p>
       <w:pPr>
         <w:spacing w:after="0"/>
-      </w:pPr>
-      <w:r>
-        <w:t xml:space="preserve">Eseguire </w:t>
-      </w:r>
-      <w:proofErr w:type="gramStart"/>
-      <w:r>
-        <w:t>un</w:t>
-      </w:r>
-      <w:proofErr w:type="gramEnd"/>
-      <w:r>
-        <w:t xml:space="preserve"> specifico </w:t>
-      </w:r>
+        <w:rPr>
+          <w:b/>
+          <w:bCs/>
+          <w:lang w:val="en-GB"/>
+        </w:rPr>
+      </w:pPr>
       <w:proofErr w:type="spellStart"/>
       <w:r>
-        <w:t>s</w:t>
-      </w:r>
-      <w:r>
-        <w:t>eeder</w:t>
+        <w:rPr>
+          <w:b/>
+          <w:bCs/>
+          <w:lang w:val="en-GB"/>
+        </w:rPr>
+        <w:t>Eseguire</w:t>
+      </w:r>
+      <w:proofErr w:type="spellEnd"/>
+      <w:r>
+        <w:rPr>
+          <w:b/>
+          <w:bCs/>
+          <w:lang w:val="en-GB"/>
+        </w:rPr>
+        <w:t xml:space="preserve"> un </w:t>
+      </w:r>
+      <w:proofErr w:type="spellStart"/>
+      <w:r>
+        <w:rPr>
+          <w:b/>
+          <w:bCs/>
+          <w:lang w:val="en-GB"/>
+        </w:rPr>
+        <w:t>specifico</w:t>
+      </w:r>
+      <w:proofErr w:type="spellEnd"/>
+      <w:r>
+        <w:rPr>
+          <w:b/>
+          <w:bCs/>
+          <w:lang w:val="en-GB"/>
+        </w:rPr>
+        <w:t xml:space="preserve"> </w:t>
+      </w:r>
+      <w:proofErr w:type="spellStart"/>
+      <w:r>
+        <w:rPr>
+          <w:b/>
+          <w:bCs/>
+          <w:lang w:val="en-GB"/>
+        </w:rPr>
+        <w:t>seeder</w:t>
       </w:r>
       <w:proofErr w:type="spellEnd"/>
     </w:p>
@@ -2405,8 +2504,14 @@
     <w:p>
       <w:pPr>
         <w:pStyle w:val="Titolo2"/>
-      </w:pPr>
-      <w:r>
+        <w:rPr>
+          <w:lang w:val="en-GB"/>
+        </w:rPr>
+      </w:pPr>
+      <w:r>
+        <w:rPr>
+          <w:lang w:val="en-GB"/>
+        </w:rPr>
         <w:lastRenderedPageBreak/>
         <w:t>EXAMPLES</w:t>
       </w:r>
@@ -2611,28 +2716,15 @@
         </w:rPr>
         <w:annotationRef/>
       </w:r>
-      <w:r>
-        <w:fldChar w:fldCharType="begin"/>
-      </w:r>
-      <w:r>
-        <w:rPr>
-          <w:lang w:val="en-GB"/>
-        </w:rPr>
-        <w:instrText>HYPERLINK "https://www.php.net/manual/en/function.mail.php"</w:instrText>
-      </w:r>
-      <w:r>
-        <w:fldChar w:fldCharType="separate"/>
-      </w:r>
-      <w:r>
-        <w:rPr>
-          <w:rStyle w:val="Collegamentoipertestuale"/>
-          <w:lang w:val="en-GB"/>
-        </w:rPr>
-        <w:t>https://www.php.net/manual/en/function.mail.php</w:t>
-      </w:r>
-      <w:r>
-        <w:fldChar w:fldCharType="end"/>
-      </w:r>
+      <w:hyperlink r:id="rId1" w:history="1">
+        <w:r>
+          <w:rPr>
+            <w:rStyle w:val="Collegamentoipertestuale"/>
+            <w:lang w:val="en-GB"/>
+          </w:rPr>
+          <w:t>https://www.php.net/manual/en/function.mail.php</w:t>
+        </w:r>
+      </w:hyperlink>
     </w:p>
     <w:p>
       <w:pPr>
@@ -2750,7 +2842,7 @@
         </w:rPr>
         <w:annotationRef/>
       </w:r>
-      <w:hyperlink r:id="rId1" w:history="1">
+      <w:hyperlink r:id="rId2" w:history="1">
         <w:r>
           <w:rPr>
             <w:rStyle w:val="Collegamentoipertestuale"/>

</xml_diff>

<commit_message>
Updated Event table with "Location" table, with 1-N association. Handled in FE and BE. Fix with Save Form in eventShow.twig
</commit_message>
<xml_diff>
--- a/docs/Unibo-MatchSkills.docx
+++ b/docs/Unibo-MatchSkills.docx
@@ -1947,7 +1947,7 @@
         <w:rPr>
           <w:lang w:val="en-GB"/>
         </w:rPr>
-        <w:t>AddAccessTypeToEvent</w:t>
+        <w:t>CreateLocationTableAndLinkToEvent</w:t>
       </w:r>
       <w:proofErr w:type="spellEnd"/>
       <w:r>
@@ -2716,15 +2716,28 @@
         </w:rPr>
         <w:annotationRef/>
       </w:r>
-      <w:hyperlink r:id="rId1" w:history="1">
-        <w:r>
-          <w:rPr>
-            <w:rStyle w:val="Collegamentoipertestuale"/>
-            <w:lang w:val="en-GB"/>
-          </w:rPr>
-          <w:t>https://www.php.net/manual/en/function.mail.php</w:t>
-        </w:r>
-      </w:hyperlink>
+      <w:r>
+        <w:fldChar w:fldCharType="begin"/>
+      </w:r>
+      <w:r>
+        <w:rPr>
+          <w:lang w:val="en-GB"/>
+        </w:rPr>
+        <w:instrText>HYPERLINK "https://www.php.net/manual/en/function.mail.php"</w:instrText>
+      </w:r>
+      <w:r>
+        <w:fldChar w:fldCharType="separate"/>
+      </w:r>
+      <w:r>
+        <w:rPr>
+          <w:rStyle w:val="Collegamentoipertestuale"/>
+          <w:lang w:val="en-GB"/>
+        </w:rPr>
+        <w:t>https://www.php.net/manual/en/function.mail.php</w:t>
+      </w:r>
+      <w:r>
+        <w:fldChar w:fldCharType="end"/>
+      </w:r>
     </w:p>
     <w:p>
       <w:pPr>
@@ -2842,7 +2855,7 @@
         </w:rPr>
         <w:annotationRef/>
       </w:r>
-      <w:hyperlink r:id="rId2" w:history="1">
+      <w:hyperlink r:id="rId1" w:history="1">
         <w:r>
           <w:rPr>
             <w:rStyle w:val="Collegamentoipertestuale"/>

</xml_diff>